<commit_message>
updated version of product vision
</commit_message>
<xml_diff>
--- a/planning/Product Vision.docx
+++ b/planning/Product Vision.docx
@@ -71,11 +71,6 @@
       </w:r>
     </w:p>
     <w:p>
-      <w:pPr>
-        <w:rPr>
-          <w:rFonts w:hint="eastAsia"/>
-        </w:rPr>
-      </w:pPr>
       <w:r>
         <w:t xml:space="preserve">The Healthy Lifestyle Abb is </w:t>
       </w:r>
@@ -110,10 +105,13 @@
         <w:t xml:space="preserve"> track </w:t>
       </w:r>
       <w:r>
-        <w:t xml:space="preserve">their daily habits and </w:t>
-      </w:r>
-      <w:r>
-        <w:t xml:space="preserve">access to professional medical support. </w:t>
+        <w:t xml:space="preserve">their daily habits </w:t>
+      </w:r>
+      <w:r>
+        <w:t>such as training activity and mental health tracker</w:t>
+      </w:r>
+      <w:r>
+        <w:t xml:space="preserve">. </w:t>
       </w:r>
     </w:p>
     <w:p>
@@ -158,10 +156,10 @@
         <w:t xml:space="preserve"> that provides </w:t>
       </w:r>
       <w:r>
-        <w:t xml:space="preserve">personalized health monitoring and </w:t>
-      </w:r>
-      <w:r>
-        <w:t xml:space="preserve">access to the campus medical support. It </w:t>
+        <w:t>personalized health monitoring</w:t>
+      </w:r>
+      <w:r>
+        <w:t xml:space="preserve">. It </w:t>
       </w:r>
       <w:r>
         <w:t xml:space="preserve">includes features such as </w:t>
@@ -249,18 +247,10 @@
         <w:t xml:space="preserve">Our software </w:t>
       </w:r>
       <w:r>
-        <w:t xml:space="preserve">follows </w:t>
-      </w:r>
-      <w:proofErr w:type="gramStart"/>
-      <w:r>
-        <w:t>the</w:t>
-      </w:r>
-      <w:r>
-        <w:t xml:space="preserve"> SDG</w:t>
-      </w:r>
-      <w:proofErr w:type="gramEnd"/>
-      <w:r>
-        <w:t xml:space="preserve"> 3 targets by:</w:t>
+        <w:t>follows the</w:t>
+      </w:r>
+      <w:r>
+        <w:t xml:space="preserve"> SDG 3 targets by:</w:t>
       </w:r>
     </w:p>
     <w:p>
@@ -272,10 +262,19 @@
         </w:numPr>
       </w:pPr>
       <w:r>
-        <w:t>Target 3.4</w:t>
-      </w:r>
-      <w:r>
-        <w:t xml:space="preserve"> (Mental Health &amp; Wellbeing): By providing mood tracking and stress management resources to reduce non </w:t>
+        <w:t xml:space="preserve">Target 3.4 </w:t>
+      </w:r>
+      <w:r>
+        <w:t>(</w:t>
+      </w:r>
+      <w:r>
+        <w:t>Reduce Mortality from Non-Communicable Diseases (NCDs) &amp; Promote Mental Health</w:t>
+      </w:r>
+      <w:r>
+        <w:t>)</w:t>
+      </w:r>
+      <w:r>
+        <w:t xml:space="preserve">: By providing mood tracking and stress management resources to reduce non </w:t>
       </w:r>
       <w:r>
         <w:t>communicable</w:t>
@@ -299,36 +298,25 @@
         </w:numPr>
       </w:pPr>
       <w:r>
-        <w:t xml:space="preserve">Target 3.8 (Access to </w:t>
-      </w:r>
-      <w:r>
-        <w:t>Healthcare</w:t>
-      </w:r>
-      <w:r>
-        <w:t xml:space="preserve">): </w:t>
-      </w:r>
-      <w:r>
-        <w:t xml:space="preserve">by digitalizing the university clinic </w:t>
-      </w:r>
-      <w:r>
-        <w:t>appointment</w:t>
-      </w:r>
-      <w:r>
-        <w:t xml:space="preserve"> system allowing </w:t>
-      </w:r>
-      <w:r>
-        <w:t>students</w:t>
-      </w:r>
-      <w:r>
-        <w:t xml:space="preserve"> to visit the medical </w:t>
-      </w:r>
-      <w:proofErr w:type="gramStart"/>
-      <w:r>
-        <w:t>advise</w:t>
-      </w:r>
-      <w:proofErr w:type="gramEnd"/>
-      <w:r>
-        <w:t xml:space="preserve"> without waiting for long time at the clinic. </w:t>
+        <w:t xml:space="preserve">Target </w:t>
+      </w:r>
+      <w:r>
+        <w:t>3.D</w:t>
+      </w:r>
+      <w:r>
+        <w:t xml:space="preserve"> (</w:t>
+      </w:r>
+      <w:r>
+        <w:t>Strengthen Early Warning and Health Risk Management</w:t>
+      </w:r>
+      <w:r>
+        <w:t xml:space="preserve">): by monitoring </w:t>
+      </w:r>
+      <w:r>
+        <w:t>hydration level and calories burn in real-time, it allows student to identify poor health pattern and correct before it turn into a medical concern</w:t>
+      </w:r>
+      <w:r>
+        <w:t xml:space="preserve">. </w:t>
       </w:r>
     </w:p>
     <w:p>
@@ -2191,6 +2179,15 @@
 </file>
 
 <file path=customXml/item1.xml><?xml version="1.0" encoding="utf-8"?>
+<?mso-contentType ?>
+<FormTemplates xmlns="http://schemas.microsoft.com/sharepoint/v3/contenttype/forms">
+  <Display>DocumentLibraryForm</Display>
+  <Edit>DocumentLibraryForm</Edit>
+  <New>DocumentLibraryForm</New>
+</FormTemplates>
+</file>
+
+<file path=customXml/item2.xml><?xml version="1.0" encoding="utf-8"?>
 <b:Sources xmlns:b="http://schemas.openxmlformats.org/officeDocument/2006/bibliography" xmlns="http://schemas.openxmlformats.org/officeDocument/2006/bibliography" SelectedStyle="\APASixthEditionOfficeOnline.xsl" StyleName="APA" Version="6">
   <b:Source>
     <b:Tag>The2</b:Tag>
@@ -2204,16 +2201,15 @@
 </b:Sources>
 </file>
 
-<file path=customXml/item2.xml><?xml version="1.0" encoding="utf-8"?>
-<?mso-contentType ?>
-<FormTemplates xmlns="http://schemas.microsoft.com/sharepoint/v3/contenttype/forms">
-  <Display>DocumentLibraryForm</Display>
-  <Edit>DocumentLibraryForm</Edit>
-  <New>DocumentLibraryForm</New>
-</FormTemplates>
+<file path=customXml/item3.xml><?xml version="1.0" encoding="utf-8"?>
+<p:properties xmlns:p="http://schemas.microsoft.com/office/2006/metadata/properties" xmlns:xsi="http://www.w3.org/2001/XMLSchema-instance" xmlns:pc="http://schemas.microsoft.com/office/infopath/2007/PartnerControls">
+  <documentManagement>
+    <_activity xmlns="51d27ca4-3a72-4789-bacd-627947868fc9" xsi:nil="true"/>
+  </documentManagement>
+</p:properties>
 </file>
 
-<file path=customXml/item3.xml><?xml version="1.0" encoding="utf-8"?>
+<file path=customXml/item4.xml><?xml version="1.0" encoding="utf-8"?>
 <ct:contentTypeSchema xmlns:ct="http://schemas.microsoft.com/office/2006/metadata/contentType" xmlns:ma="http://schemas.microsoft.com/office/2006/metadata/properties/metaAttributes" ct:_="" ma:_="" ma:contentTypeName="Document" ma:contentTypeID="0x01010000D12BE9158A164687F3E8B926ED3A01" ma:contentTypeVersion="11" ma:contentTypeDescription="Create a new document." ma:contentTypeScope="" ma:versionID="124bb1b92c76bda33a58b69735ca20f4">
   <xsd:schema xmlns:xsd="http://www.w3.org/2001/XMLSchema" xmlns:xs="http://www.w3.org/2001/XMLSchema" xmlns:p="http://schemas.microsoft.com/office/2006/metadata/properties" xmlns:ns3="51d27ca4-3a72-4789-bacd-627947868fc9" targetNamespace="http://schemas.microsoft.com/office/2006/metadata/properties" ma:root="true" ma:fieldsID="fd5608e812f07bb0578ee523664546ed" ns3:_="">
     <xsd:import namespace="51d27ca4-3a72-4789-bacd-627947868fc9"/>
@@ -2401,15 +2397,15 @@
 </ct:contentTypeSchema>
 </file>
 
-<file path=customXml/item4.xml><?xml version="1.0" encoding="utf-8"?>
-<p:properties xmlns:p="http://schemas.microsoft.com/office/2006/metadata/properties" xmlns:xsi="http://www.w3.org/2001/XMLSchema-instance" xmlns:pc="http://schemas.microsoft.com/office/infopath/2007/PartnerControls">
-  <documentManagement>
-    <_activity xmlns="51d27ca4-3a72-4789-bacd-627947868fc9" xsi:nil="true"/>
-  </documentManagement>
-</p:properties>
+<file path=customXml/itemProps1.xml><?xml version="1.0" encoding="utf-8"?>
+<ds:datastoreItem xmlns:ds="http://schemas.openxmlformats.org/officeDocument/2006/customXml" ds:itemID="{34E3329E-BB80-4F0E-927B-6AB1280DC1A1}">
+  <ds:schemaRefs>
+    <ds:schemaRef ds:uri="http://schemas.microsoft.com/sharepoint/v3/contenttype/forms"/>
+  </ds:schemaRefs>
+</ds:datastoreItem>
 </file>
 
-<file path=customXml/itemProps1.xml><?xml version="1.0" encoding="utf-8"?>
+<file path=customXml/itemProps2.xml><?xml version="1.0" encoding="utf-8"?>
 <ds:datastoreItem xmlns:ds="http://schemas.openxmlformats.org/officeDocument/2006/customXml" ds:itemID="{1A9E3D24-0EFB-4D69-AA0B-939BD7F4C311}">
   <ds:schemaRefs>
     <ds:schemaRef ds:uri="http://schemas.openxmlformats.org/officeDocument/2006/bibliography"/>
@@ -2417,15 +2413,17 @@
 </ds:datastoreItem>
 </file>
 
-<file path=customXml/itemProps2.xml><?xml version="1.0" encoding="utf-8"?>
-<ds:datastoreItem xmlns:ds="http://schemas.openxmlformats.org/officeDocument/2006/customXml" ds:itemID="{34E3329E-BB80-4F0E-927B-6AB1280DC1A1}">
+<file path=customXml/itemProps3.xml><?xml version="1.0" encoding="utf-8"?>
+<ds:datastoreItem xmlns:ds="http://schemas.openxmlformats.org/officeDocument/2006/customXml" ds:itemID="{80B1682C-45E8-47AB-BCCD-610D4FAADAFD}">
   <ds:schemaRefs>
-    <ds:schemaRef ds:uri="http://schemas.microsoft.com/sharepoint/v3/contenttype/forms"/>
+    <ds:schemaRef ds:uri="http://schemas.microsoft.com/office/2006/metadata/properties"/>
+    <ds:schemaRef ds:uri="http://schemas.microsoft.com/office/infopath/2007/PartnerControls"/>
+    <ds:schemaRef ds:uri="51d27ca4-3a72-4789-bacd-627947868fc9"/>
   </ds:schemaRefs>
 </ds:datastoreItem>
 </file>
 
-<file path=customXml/itemProps3.xml><?xml version="1.0" encoding="utf-8"?>
+<file path=customXml/itemProps4.xml><?xml version="1.0" encoding="utf-8"?>
 <ds:datastoreItem xmlns:ds="http://schemas.openxmlformats.org/officeDocument/2006/customXml" ds:itemID="{E1B35BB3-66FE-4D94-B442-4FCDB1C8730E}">
   <ds:schemaRefs>
     <ds:schemaRef ds:uri="http://schemas.microsoft.com/office/2006/metadata/contentType"/>
@@ -2441,14 +2439,4 @@
     <ds:schemaRef ds:uri="http://schemas.microsoft.com/internal/obd"/>
   </ds:schemaRefs>
 </ds:datastoreItem>
-</file>
-
-<file path=customXml/itemProps4.xml><?xml version="1.0" encoding="utf-8"?>
-<ds:datastoreItem xmlns:ds="http://schemas.openxmlformats.org/officeDocument/2006/customXml" ds:itemID="{80B1682C-45E8-47AB-BCCD-610D4FAADAFD}">
-  <ds:schemaRefs>
-    <ds:schemaRef ds:uri="http://schemas.microsoft.com/office/2006/metadata/properties"/>
-    <ds:schemaRef ds:uri="http://schemas.microsoft.com/office/infopath/2007/PartnerControls"/>
-    <ds:schemaRef ds:uri="51d27ca4-3a72-4789-bacd-627947868fc9"/>
-  </ds:schemaRefs>
-</ds:datastoreItem>
 </file>
</xml_diff>